<commit_message>
feast: merubah tampillan login
</commit_message>
<xml_diff>
--- a/DOKUMENTASI_SOURCE_CODE_PROJECT.docx
+++ b/DOKUMENTASI_SOURCE_CODE_PROJECT.docx
@@ -6778,6 +6778,34 @@
         <w:t xml:space="preserve">        $water_level = $request-&gt;water_level;</w:t>
         <w:br/>
         <w:br/>
+        <w:t xml:space="preserve">        // --- TAMBAHAN FITUR HUJAN ---</w:t>
+        <w:br/>
+        <w:t xml:space="preserve">        // 1. Tangkap angka curah hujan (Default 0 jika alat IoT belum ngirim)</w:t>
+        <w:br/>
+        <w:t xml:space="preserve">        $rain_value = $request-&gt;rain_value ?? 0;</w:t>
+        <w:br/>
+        <w:br/>
+        <w:t xml:space="preserve">        // 2. Tentukan Teks Status Hujan Otomatis berdasarkan Angka</w:t>
+        <w:br/>
+        <w:t xml:space="preserve">        $rain_status = 'CERAH';</w:t>
+        <w:br/>
+        <w:t xml:space="preserve">        if ($rain_value &gt; 0 &amp;&amp; $rain_value &lt;= 10) {</w:t>
+        <w:br/>
+        <w:t xml:space="preserve">            $rain_status = 'GERIMIS';</w:t>
+        <w:br/>
+        <w:t xml:space="preserve">        } elseif ($rain_value &gt; 10 &amp;&amp; $rain_value &lt;= 30) {</w:t>
+        <w:br/>
+        <w:t xml:space="preserve">            $rain_status = 'HUJAN SEDANG';</w:t>
+        <w:br/>
+        <w:t xml:space="preserve">        } elseif ($rain_value &gt; 30) {</w:t>
+        <w:br/>
+        <w:t xml:space="preserve">            $rain_status = 'HUJAN LEBAT';</w:t>
+        <w:br/>
+        <w:t xml:space="preserve">        }</w:t>
+        <w:br/>
+        <w:t xml:space="preserve">        // ----------------------------</w:t>
+        <w:br/>
+        <w:br/>
         <w:t xml:space="preserve">        $threshold = Threshold::first();</w:t>
         <w:br/>
         <w:t xml:space="preserve">        $batasSiaga = $threshold ? $threshold-&gt;batas_siaga : 100; </w:t>
@@ -6798,13 +6826,17 @@
         <w:t xml:space="preserve">        }</w:t>
         <w:br/>
         <w:br/>
+        <w:t xml:space="preserve">        // Simpan semua data ke database (Termasuk data hujan)</w:t>
+        <w:br/>
         <w:t xml:space="preserve">        $sensorData = SensorData::create([</w:t>
         <w:br/>
         <w:t xml:space="preserve">            'water_level' =&gt; $water_level,</w:t>
         <w:br/>
         <w:t xml:space="preserve">            'status' =&gt; $status,</w:t>
         <w:br/>
-        <w:t xml:space="preserve">            'rain_status' =&gt; $request-&gt;rain_status ?? 'NORMAL',</w:t>
+        <w:t xml:space="preserve">            'rain_value' =&gt; $rain_value,     // Disimpan ke DB</w:t>
+        <w:br/>
+        <w:t xml:space="preserve">            'rain_status' =&gt; $rain_status,   // Disimpan ke DB</w:t>
         <w:br/>
         <w:t xml:space="preserve">            'water_flow' =&gt; $request-&gt;water_flow ?? 0,</w:t>
         <w:br/>
@@ -6879,7 +6911,11 @@
         <w:br/>
         <w:t xml:space="preserve">                'level' =&gt; $water_level,</w:t>
         <w:br/>
-        <w:t xml:space="preserve">                'status' =&gt; $status</w:t>
+        <w:t xml:space="preserve">                'status' =&gt; $status,</w:t>
+        <w:br/>
+        <w:t xml:space="preserve">                'rain_value' =&gt; $rain_value,</w:t>
+        <w:br/>
+        <w:t xml:space="preserve">                'rain_status' =&gt; $rain_status</w:t>
         <w:br/>
         <w:t xml:space="preserve">            ]</w:t>
         <w:br/>
@@ -6943,12 +6979,6 @@
         <w:br/>
         <w:t xml:space="preserve">    }</w:t>
         <w:br/>
-        <w:br/>
-        <w:t xml:space="preserve">    /**</w:t>
-        <w:br/>
-        <w:t xml:space="preserve">     * Endpoint untuk menarik data terbaru ke layar secara Real-time (AJAX)</w:t>
-        <w:br/>
-        <w:t xml:space="preserve">     */</w:t>
         <w:br/>
         <w:t xml:space="preserve">    public function getLatestData()</w:t>
         <w:br/>
@@ -8368,7 +8398,9 @@
         <w:br/>
         <w:t xml:space="preserve">        'water_level',</w:t>
         <w:br/>
-        <w:t xml:space="preserve">        'rain_status',</w:t>
+        <w:t xml:space="preserve">        'rain_value',  // DITAMBAHKAN: Untuk menyimpan angka curah hujan</w:t>
+        <w:br/>
+        <w:t xml:space="preserve">        'rain_status', // DITAMBAHKAN: Untuk menyimpan teks status hujan</w:t>
         <w:br/>
         <w:t xml:space="preserve">        'water_flow',</w:t>
         <w:br/>
@@ -12682,7 +12714,15 @@
         <w:br/>
         <w:t xml:space="preserve">            $table-&gt;float('water_level'); // Level air (cm)</w:t>
         <w:br/>
-        <w:t xml:space="preserve">            $table-&gt;string('rain_status')-&gt;nullable(); // Hujan/Tidak</w:t>
+        <w:t xml:space="preserve">            </w:t>
+        <w:br/>
+        <w:t xml:space="preserve">            // --- DUA KOLOM INI ADALAH KUNCI FITUR INTENSITAS HUJAN ---</w:t>
+        <w:br/>
+        <w:t xml:space="preserve">            $table-&gt;float('rain_value')-&gt;default(0); // Angka curah hujan (mm/jam)</w:t>
+        <w:br/>
+        <w:t xml:space="preserve">            $table-&gt;string('rain_status')-&gt;nullable(); // Teks Hujan/Cerah</w:t>
+        <w:br/>
+        <w:t xml:space="preserve">            </w:t>
         <w:br/>
         <w:t xml:space="preserve">            $table-&gt;float('water_flow')-&gt;nullable();  // Kecepatan aliran</w:t>
         <w:br/>
@@ -13272,6 +13312,33 @@
         <w:t xml:space="preserve">                    &lt;/div&gt;</w:t>
         <w:br/>
         <w:br/>
+        <w:t xml:space="preserve">                    &lt;div class="bg-white rounded-[1.5rem] border border-slate-100 shadow-xl shadow-slate-200/40 p-6 flex items-center gap-5"&gt;</w:t>
+        <w:br/>
+        <w:t xml:space="preserve">                        &lt;div class="w-14 h-14 bg-indigo-50 rounded-xl text-indigo-500 flex items-center justify-center shrink-0"&gt;</w:t>
+        <w:br/>
+        <w:t xml:space="preserve">                            &lt;svg class="w-7 h-7" fill="none" stroke="currentColor" viewBox="0 0 24 24"&gt;&lt;path stroke-linecap="round" stroke-linejoin="round" stroke-width="2.5" d="M3 15h18M5 15a4 4 0 01-4-4 4 4 0 014-4h.5a5.5 5.5 0 0110.6 0H17a4 4 0 014 4 4 4 0 01-4 4m-4 4v-4m-4 4v-4m8 4v-4"&gt;&lt;/path&gt;&lt;/svg&gt;</w:t>
+        <w:br/>
+        <w:t xml:space="preserve">                        &lt;/div&gt;</w:t>
+        <w:br/>
+        <w:t xml:space="preserve">                        &lt;div&gt;</w:t>
+        <w:br/>
+        <w:t xml:space="preserve">                            &lt;p class="text-xs font-bold text-slate-400 uppercase tracking-wider"&gt;Curah Hujan&lt;/p&gt;</w:t>
+        <w:br/>
+        <w:t xml:space="preserve">                            &lt;div class="flex items-end gap-2 mt-1"&gt;</w:t>
+        <w:br/>
+        <w:t xml:space="preserve">                                &lt;h3 id="rain-value-display" class="text-4xl font-black text-slate-800 leading-none"&gt;0&lt;/h3&gt;</w:t>
+        <w:br/>
+        <w:t xml:space="preserve">                                &lt;span class="text-sm font-bold text-slate-400 mb-1"&gt;mm/jam&lt;/span&gt;</w:t>
+        <w:br/>
+        <w:t xml:space="preserve">                            &lt;/div&gt;</w:t>
+        <w:br/>
+        <w:t xml:space="preserve">                            &lt;p id="rain-status-display" class="text-xs font-bold text-indigo-500 mt-1 uppercase tracking-widest bg-indigo-50 inline-block px-2 py-0.5 rounded-md"&gt;CERAH&lt;/p&gt;</w:t>
+        <w:br/>
+        <w:t xml:space="preserve">                        &lt;/div&gt;</w:t>
+        <w:br/>
+        <w:t xml:space="preserve">                    &lt;/div&gt;</w:t>
+        <w:br/>
+        <w:br/>
         <w:t xml:space="preserve">                    &lt;div id="status-card" class="bg-gradient-to-br from-emerald-500 to-teal-500 rounded-[1.5rem] shadow-xl p-6 text-white relative overflow-hidden transition-all duration-500"&gt;</w:t>
         <w:br/>
         <w:t xml:space="preserve">                        &lt;svg class="absolute -right-4 -top-4 w-32 h-32 text-white/10" fill="currentColor" viewBox="0 0 24 24"&gt;&lt;path d="M12 2L1 21h22L12 2zm0 3.83L19.17 19H4.83L12 5.83zM11 16h2v2h-2v-2zm0-7h2v5h-2V9z"/&gt;&lt;/svg&gt;</w:t>
@@ -13461,13 +13528,28 @@
         <w:br/>
         <w:t xml:space="preserve">                        </w:t>
         <w:br/>
-        <w:t xml:space="preserve">                        // 1. Update Angka Elevasi</w:t>
+        <w:t xml:space="preserve">                        // 1. Update Angka Elevasi Air</w:t>
         <w:br/>
         <w:t xml:space="preserve">                        document.getElementById('water-level-display').innerHTML = data.latest.water_level + ' &lt;span class="text-lg font-bold text-slate-400"&gt;cm&lt;/span&gt;';</w:t>
         <w:br/>
         <w:t xml:space="preserve">                        </w:t>
         <w:br/>
-        <w:t xml:space="preserve">                        // 2. Update Teks Status</w:t>
+        <w:t xml:space="preserve">                        // 2. TAMBAHAN: Update Angka &amp; Status Hujan secara Real-time</w:t>
+        <w:br/>
+        <w:t xml:space="preserve">                        if(data.latest.rain_value !== undefined) {</w:t>
+        <w:br/>
+        <w:t xml:space="preserve">                            document.getElementById('rain-value-display').innerText = data.latest.rain_value;</w:t>
+        <w:br/>
+        <w:t xml:space="preserve">                        }</w:t>
+        <w:br/>
+        <w:t xml:space="preserve">                        if(data.latest.rain_status !== undefined) {</w:t>
+        <w:br/>
+        <w:t xml:space="preserve">                            document.getElementById('rain-status-display').innerText = data.latest.rain_status;</w:t>
+        <w:br/>
+        <w:t xml:space="preserve">                        }</w:t>
+        <w:br/>
+        <w:br/>
+        <w:t xml:space="preserve">                        // 3. Update Teks Status Bahaya</w:t>
         <w:br/>
         <w:t xml:space="preserve">                        let statusText = data.latest.status.toUpperCase();</w:t>
         <w:br/>
@@ -13477,7 +13559,7 @@
         <w:br/>
         <w:t xml:space="preserve">                        </w:t>
         <w:br/>
-        <w:t xml:space="preserve">                        // 3. Update Visual (Warna &amp; Progress Bar)</w:t>
+        <w:t xml:space="preserve">                        // 4. Update Visual Kotak Warna</w:t>
         <w:br/>
         <w:t xml:space="preserve">                        let badge = document.getElementById('badge-status-container');</w:t>
         <w:br/>
@@ -13487,8 +13569,6 @@
         <w:br/>
         <w:t xml:space="preserve">                        </w:t>
         <w:br/>
-        <w:t xml:space="preserve">                        // Bersihkan class lama</w:t>
-        <w:br/>
         <w:t xml:space="preserve">                        badge.className = 'inline-flex items-center gap-2 px-6 py-2 rounded-full text-sm font-bold mb-8 transition-all duration-500 ';</w:t>
         <w:br/>
         <w:t xml:space="preserve">                        card.className = 'rounded-[1.5rem] shadow-xl p-6 text-white relative overflow-hidden transition-all duration-500 ';</w:t>
@@ -13522,7 +13602,7 @@
         <w:br/>
         <w:t xml:space="preserve">                        </w:t>
         <w:br/>
-        <w:t xml:space="preserve">                        // 4. Update Waktu Sync</w:t>
+        <w:t xml:space="preserve">                        // 5. Update Jam Sync Terakhir</w:t>
         <w:br/>
         <w:t xml:space="preserve">                        let now = new Date();</w:t>
         <w:br/>
@@ -13530,7 +13610,7 @@
         <w:br/>
         <w:t xml:space="preserve">                        </w:t>
         <w:br/>
-        <w:t xml:space="preserve">                        // 5. Update Grafik</w:t>
+        <w:t xml:space="preserve">                        // 6. Update Grafik Bergerak</w:t>
         <w:br/>
         <w:t xml:space="preserve">                        window.myChart.data.labels = data.history.map(item =&gt; item.time);</w:t>
         <w:br/>
@@ -13543,7 +13623,7 @@
         <w:t xml:space="preserve">            }</w:t>
         <w:br/>
         <w:br/>
-        <w:t xml:space="preserve">            // Jalankan setiap 3 detik</w:t>
+        <w:t xml:space="preserve">            // Eksekusi setiap 3 detik</w:t>
         <w:br/>
         <w:t xml:space="preserve">            fetchRealTimeData();</w:t>
         <w:br/>
@@ -15302,35 +15382,53 @@
         <w:br/>
         <w:t xml:space="preserve">        @vite(['resources/css/app.css', 'resources/js/app.js'])</w:t>
         <w:br/>
+        <w:t xml:space="preserve">        &lt;script src="https://cdn.jsdelivr.net/npm/chart.js"&gt;&lt;/script&gt;</w:t>
+        <w:br/>
         <w:t xml:space="preserve">    &lt;/head&gt;</w:t>
         <w:br/>
-        <w:t xml:space="preserve">    &lt;body class="font-sans antialiased text-slate-300 bg-slate-950"&gt;</w:t>
-        <w:br/>
-        <w:t xml:space="preserve">        &lt;div class="min-h-screen bg-slate-950"&gt;</w:t>
+        <w:t xml:space="preserve">    &lt;body class="font-sans antialiased text-slate-300 bg-slate-950 overflow-hidden"&gt;</w:t>
+        <w:br/>
+        <w:t xml:space="preserve">        </w:t>
+        <w:br/>
+        <w:t xml:space="preserve">        &lt;div class="h-[100dvh] flex flex-col md:flex-row bg-slate-950 w-full"&gt;</w:t>
+        <w:br/>
+        <w:t xml:space="preserve">            </w:t>
         <w:br/>
         <w:t xml:space="preserve">            @include('layouts.navigation')</w:t>
         <w:br/>
         <w:br/>
-        <w:t xml:space="preserve">            @isset($header)</w:t>
-        <w:br/>
-        <w:t xml:space="preserve">                &lt;header class="bg-slate-900 border-b border-slate-800 shadow"&gt;</w:t>
-        <w:br/>
-        <w:t xml:space="preserve">                    &lt;div class="max-w-7xl mx-auto py-6 px-4 sm:px-6 lg:px-8"&gt;</w:t>
-        <w:br/>
-        <w:t xml:space="preserve">                        {{ $header }}</w:t>
+        <w:t xml:space="preserve">            &lt;div class="flex-1 flex flex-col min-w-0 overflow-y-auto bg-slate-950 relative"&gt;</w:t>
+        <w:br/>
+        <w:t xml:space="preserve">                </w:t>
+        <w:br/>
+        <w:t xml:space="preserve">                &lt;div class="sticky top-0 z-40 bg-slate-900/90 backdrop-blur-md border-b border-slate-800 h-[60px] md:h-[89px] shrink-0 flex items-center justify-end px-6 sm:px-8"&gt;</w:t>
         <w:br/>
         <w:t xml:space="preserve">                    &lt;/div&gt;</w:t>
         <w:br/>
-        <w:t xml:space="preserve">                &lt;/header&gt;</w:t>
-        <w:br/>
-        <w:t xml:space="preserve">            @endisset</w:t>
-        <w:br/>
-        <w:br/>
-        <w:t xml:space="preserve">            &lt;main&gt;</w:t>
-        <w:br/>
-        <w:t xml:space="preserve">                {{ $slot }}</w:t>
-        <w:br/>
-        <w:t xml:space="preserve">            &lt;/main&gt;</w:t>
+        <w:br/>
+        <w:t xml:space="preserve">                @isset($header)</w:t>
+        <w:br/>
+        <w:t xml:space="preserve">                    &lt;header class="bg-slate-900 border-b border-slate-800 shadow shrink-0 relative z-20"&gt;</w:t>
+        <w:br/>
+        <w:t xml:space="preserve">                        &lt;div class="max-w-7xl mx-auto py-4 px-4 sm:py-6 sm:px-6 lg:px-8"&gt;</w:t>
+        <w:br/>
+        <w:t xml:space="preserve">                            {{ $header }}</w:t>
+        <w:br/>
+        <w:t xml:space="preserve">                        &lt;/div&gt;</w:t>
+        <w:br/>
+        <w:t xml:space="preserve">                    &lt;/header&gt;</w:t>
+        <w:br/>
+        <w:t xml:space="preserve">                @endisset</w:t>
+        <w:br/>
+        <w:br/>
+        <w:t xml:space="preserve">                &lt;main class="flex-1 relative pb-12"&gt;</w:t>
+        <w:br/>
+        <w:t xml:space="preserve">                    {{ $slot }}</w:t>
+        <w:br/>
+        <w:t xml:space="preserve">                &lt;/main&gt;</w:t>
+        <w:br/>
+        <w:t xml:space="preserve">            &lt;/div&gt;</w:t>
+        <w:br/>
         <w:br/>
         <w:t xml:space="preserve">        &lt;/div&gt;</w:t>
         <w:br/>
@@ -15578,120 +15676,130 @@
           <w:rFonts w:ascii="Courier New" w:hAnsi="Courier New"/>
           <w:sz w:val="18"/>
         </w:rPr>
-        <w:t>&lt;nav x-data="{ open: false }" class="bg-slate-900 border-b border-slate-800"&gt;</w:t>
-        <w:br/>
-        <w:t xml:space="preserve">    &lt;div class="max-w-7xl mx-auto px-4 sm:px-6 lg:px-8"&gt;</w:t>
-        <w:br/>
-        <w:t xml:space="preserve">        &lt;div class="flex justify-between h-16"&gt;</w:t>
-        <w:br/>
-        <w:t xml:space="preserve">            &lt;div class="flex"&gt;</w:t>
-        <w:br/>
-        <w:t xml:space="preserve">                &lt;div class="shrink-0 flex items-center"&gt;</w:t>
-        <w:br/>
-        <w:t xml:space="preserve">                    &lt;a href="{{ route('dashboard') }}" class="flex items-center gap-2"&gt;</w:t>
-        <w:br/>
-        <w:t xml:space="preserve">                        &lt;div class="w-8 h-8 bg-cyan-500 rounded-lg flex items-center justify-center shadow-[0_0_10px_rgba(6,182,212,0.5)]"&gt;</w:t>
-        <w:br/>
-        <w:t xml:space="preserve">                            &lt;svg class="w-5 h-5 text-white" fill="none" stroke="currentColor" viewBox="0 0 24 24"&gt;&lt;path stroke-linecap="round" stroke-linejoin="round" stroke-width="2" d="M13 10V3L4 14h7v7l9-11h-7z"&gt;&lt;/path&gt;&lt;/svg&gt;</w:t>
-        <w:br/>
-        <w:t xml:space="preserve">                        &lt;/div&gt;</w:t>
-        <w:br/>
-        <w:t xml:space="preserve">                        &lt;span class="font-bold text-white tracking-widest"&gt;ADMIN&lt;/span&gt;</w:t>
-        <w:br/>
-        <w:t xml:space="preserve">                    &lt;/a&gt;</w:t>
-        <w:br/>
-        <w:t xml:space="preserve">                &lt;/div&gt;</w:t>
-        <w:br/>
-        <w:br/>
-        <w:t xml:space="preserve">                &lt;div class="hidden space-x-8 sm:-my-px sm:ms-10 sm:flex"&gt;</w:t>
-        <w:br/>
-        <w:t xml:space="preserve">                    </w:t>
-        <w:br/>
-        <w:t xml:space="preserve">                    &lt;x-nav-link :href="route('dashboard')" :active="request()-&gt;routeIs('dashboard')" class="text-slate-300 hover:text-cyan-400 hover:border-cyan-400"&gt;</w:t>
-        <w:br/>
-        <w:t xml:space="preserve">                        {{ __('Command Center') }}</w:t>
-        <w:br/>
-        <w:t xml:space="preserve">                    &lt;/x-nav-link&gt;</w:t>
-        <w:br/>
-        <w:t xml:space="preserve">                    </w:t>
-        <w:br/>
-        <w:t xml:space="preserve">                    &lt;x-nav-link :href="route('contacts.index')" :active="request()-&gt;routeIs('contacts.index')" class="text-slate-300 hover:text-cyan-400 hover:border-cyan-400"&gt;</w:t>
-        <w:br/>
-        <w:t xml:space="preserve">                        {{ __('Manajemen Kontak') }}</w:t>
-        <w:br/>
-        <w:t xml:space="preserve">                    &lt;/x-nav-link&gt;</w:t>
-        <w:br/>
-        <w:br/>
-        <w:t xml:space="preserve">                    &lt;x-nav-link :href="route('threshold.index')" :active="request()-&gt;routeIs('threshold.index')" class="text-slate-300 hover:text-cyan-400 hover:border-cyan-400"&gt;</w:t>
-        <w:br/>
-        <w:t xml:space="preserve">                        {{ __('Ambang Batas') }}</w:t>
-        <w:br/>
-        <w:t xml:space="preserve">                    &lt;/x-nav-link&gt;</w:t>
-        <w:br/>
-        <w:t xml:space="preserve">                &lt;/div&gt;</w:t>
+        <w:t>&lt;nav x-data="{ open: false }" class="bg-slate-900 border-b border-slate-800 md:border-b-0 md:border-r md:w-[300px] w-full shrink-0 flex flex-col md:h-[100dvh] relative z-50"&gt;</w:t>
+        <w:br/>
+        <w:t xml:space="preserve">    </w:t>
+        <w:br/>
+        <w:t xml:space="preserve">    &lt;div class="flex items-center justify-between px-6 md:px-8 py-4 md:py-6 border-b border-slate-800 shrink-0 w-full relative z-50 bg-slate-900"&gt;</w:t>
+        <w:br/>
+        <w:t xml:space="preserve">        &lt;div class="flex items-center gap-3 md:gap-4"&gt;</w:t>
+        <w:br/>
+        <w:t xml:space="preserve">            &lt;div class="w-8 h-8 md:w-10 md:h-10 bg-cyan-500/10 text-cyan-400 rounded-xl flex items-center justify-center border border-cyan-500/20 font-black text-sm md:text-base shadow-[0_0_15px_rgba(34,211,238,0.1)]"&gt;</w:t>
+        <w:br/>
+        <w:t xml:space="preserve">                EWS</w:t>
         <w:br/>
         <w:t xml:space="preserve">            &lt;/div&gt;</w:t>
         <w:br/>
-        <w:br/>
-        <w:t xml:space="preserve">            &lt;div class="hidden sm:flex sm:items-center sm:ms-6"&gt;</w:t>
-        <w:br/>
-        <w:t xml:space="preserve">                &lt;x-dropdown align="right" width="48"&gt;</w:t>
-        <w:br/>
-        <w:t xml:space="preserve">                    &lt;x-slot name="trigger"&gt;</w:t>
-        <w:br/>
-        <w:t xml:space="preserve">                        &lt;button class="inline-flex items-center px-3 py-2 border border-transparent text-sm leading-4 font-medium rounded-md text-slate-300 bg-slate-800 hover:text-white focus:outline-none transition ease-in-out duration-150"&gt;</w:t>
-        <w:br/>
-        <w:t xml:space="preserve">                            &lt;div&gt;{{ Auth::user()-&gt;name }}&lt;/div&gt;</w:t>
-        <w:br/>
-        <w:t xml:space="preserve">                            &lt;div class="ms-1"&gt;</w:t>
-        <w:br/>
-        <w:t xml:space="preserve">                                &lt;svg class="fill-current h-4 w-4" xmlns="http://www.w3.org/2000/svg" viewBox="0 0 20 20"&gt;</w:t>
-        <w:br/>
-        <w:t xml:space="preserve">                                    &lt;path fill-rule="evenodd" d="M5.293 7.293a1 1 0 011.414 0L10 10.586l3.293-3.293a1 1 0 111.414 1.414l-4 4a1 1 0 01-1.414 0l-4-4a1 1 0 010-1.414z" clip-rule="evenodd" /&gt;</w:t>
-        <w:br/>
-        <w:t xml:space="preserve">                                &lt;/svg&gt;</w:t>
-        <w:br/>
-        <w:t xml:space="preserve">                            &lt;/div&gt;</w:t>
-        <w:br/>
-        <w:t xml:space="preserve">                        &lt;/button&gt;</w:t>
-        <w:br/>
-        <w:t xml:space="preserve">                    &lt;/x-slot&gt;</w:t>
-        <w:br/>
-        <w:br/>
-        <w:t xml:space="preserve">                    &lt;x-slot name="content"&gt;</w:t>
-        <w:br/>
-        <w:t xml:space="preserve">                        &lt;div class="bg-slate-800 text-slate-300 rounded-md"&gt;</w:t>
-        <w:br/>
-        <w:t xml:space="preserve">                            &lt;x-dropdown-link :href="route('profile.edit')" class="hover:bg-slate-700 hover:text-white"&gt;</w:t>
-        <w:br/>
-        <w:t xml:space="preserve">                                {{ __('Profile') }}</w:t>
-        <w:br/>
-        <w:t xml:space="preserve">                            &lt;/x-dropdown-link&gt;</w:t>
-        <w:br/>
-        <w:br/>
-        <w:t xml:space="preserve">                            &lt;form method="POST" action="{{ route('logout') }}"&gt;</w:t>
-        <w:br/>
-        <w:t xml:space="preserve">                                @csrf</w:t>
-        <w:br/>
-        <w:t xml:space="preserve">                                &lt;x-dropdown-link :href="route('logout')"</w:t>
-        <w:br/>
-        <w:t xml:space="preserve">                                        onclick="event.preventDefault(); this.closest('form').submit();" class="hover:bg-slate-700 hover:text-white text-rose-400"&gt;</w:t>
-        <w:br/>
-        <w:t xml:space="preserve">                                    {{ __('Log Out') }}</w:t>
-        <w:br/>
-        <w:t xml:space="preserve">                                &lt;/x-dropdown-link&gt;</w:t>
-        <w:br/>
-        <w:t xml:space="preserve">                            &lt;/form&gt;</w:t>
-        <w:br/>
-        <w:t xml:space="preserve">                        &lt;/div&gt;</w:t>
-        <w:br/>
-        <w:t xml:space="preserve">                    &lt;/x-slot&gt;</w:t>
-        <w:br/>
-        <w:t xml:space="preserve">                &lt;/x-dropdown&gt;</w:t>
+        <w:t xml:space="preserve">            &lt;div class="flex flex-col"&gt;</w:t>
+        <w:br/>
+        <w:t xml:space="preserve">                &lt;span class="font-black text-white text-xs md:text-sm tracking-widest uppercase leading-none"&gt;BPBD KOTA&lt;/span&gt;</w:t>
+        <w:br/>
+        <w:t xml:space="preserve">                &lt;span class="font-bold text-cyan-400 text-[9px] md:text-[11px] tracking-wider uppercase mt-1 md:mt-1.5 leading-none"&gt;TEGAL&lt;/span&gt;</w:t>
         <w:br/>
         <w:t xml:space="preserve">            &lt;/div&gt;</w:t>
         <w:br/>
         <w:t xml:space="preserve">        &lt;/div&gt;</w:t>
+        <w:br/>
+        <w:br/>
+        <w:t xml:space="preserve">        &lt;div class="md:hidden flex items-center"&gt;</w:t>
+        <w:br/>
+        <w:t xml:space="preserve">            &lt;button @click="open = ! open" class="text-slate-400 hover:text-white p-2 bg-slate-800/50 rounded-lg focus:outline-none transition-colors"&gt;</w:t>
+        <w:br/>
+        <w:t xml:space="preserve">                &lt;svg class="h-5 w-5" fill="none" stroke="currentColor" viewBox="0 0 24 24"&gt;</w:t>
+        <w:br/>
+        <w:t xml:space="preserve">                    &lt;path stroke-linecap="round" stroke-linejoin="round" stroke-width="2" d="M4 6h16M4 12h16M4 18h16" /&gt;</w:t>
+        <w:br/>
+        <w:t xml:space="preserve">                &lt;/svg&gt;</w:t>
+        <w:br/>
+        <w:t xml:space="preserve">            &lt;/button&gt;</w:t>
+        <w:br/>
+        <w:t xml:space="preserve">        &lt;/div&gt;</w:t>
+        <w:br/>
+        <w:t xml:space="preserve">    &lt;/div&gt;</w:t>
+        <w:br/>
+        <w:br/>
+        <w:t xml:space="preserve">    &lt;div x-show="open" @click="open = false" x-transition:enter="transition ease-out duration-300" x-transition:enter-start="opacity-0" x-transition:enter-end="opacity-100" x-transition:leave="transition ease-in duration-200" x-transition:leave-start="opacity-100" x-transition:leave-end="opacity-0" class="fixed inset-0 bg-black/60 z-40 md:hidden backdrop-blur-xs"&gt;&lt;/div&gt;</w:t>
+        <w:br/>
+        <w:br/>
+        <w:t xml:space="preserve">    &lt;div :class="open ? 'translate-x-0' : '-translate-x-full md:translate-x-0'" </w:t>
+        <w:br/>
+        <w:t xml:space="preserve">         class="fixed md:relative top-0 left-0 h-full md:h-[calc(100dvh-89px)] w-1/2 md:w-full bg-slate-900 border-r border-slate-800 md:border-none p-5 md:p-6 transition-transform duration-300 ease-in-out flex flex-col justify-between z-40 overflow-y-auto"&gt;</w:t>
+        <w:br/>
+        <w:t xml:space="preserve">         </w:t>
+        <w:br/>
+        <w:t xml:space="preserve">         &lt;div class="space-y-2 md:space-y-3 w-full"&gt;</w:t>
+        <w:br/>
+        <w:t xml:space="preserve">             &lt;div class="flex items-center justify-between md:hidden pb-3 border-b border-slate-800 mb-4 pt-2"&gt;</w:t>
+        <w:br/>
+        <w:t xml:space="preserve">                 &lt;span class="font-black text-cyan-400 text-[10px] tracking-widest uppercase"&gt;Navigasi&lt;/span&gt;</w:t>
+        <w:br/>
+        <w:t xml:space="preserve">                 &lt;button @click="open = false" class="text-slate-400 hover:text-white p-1"&gt;</w:t>
+        <w:br/>
+        <w:t xml:space="preserve">                     &lt;svg class="w-5 h-5" fill="none" stroke="currentColor" viewBox="0 0 24 24"&gt;</w:t>
+        <w:br/>
+        <w:t xml:space="preserve">                         &lt;path stroke-linecap="round" stroke-linejoin="round" stroke-width="2" d="M6 18L18 6M6 6l12 12"/&gt;</w:t>
+        <w:br/>
+        <w:t xml:space="preserve">                     &lt;/svg&gt;</w:t>
+        <w:br/>
+        <w:t xml:space="preserve">                 &lt;/button&gt;</w:t>
+        <w:br/>
+        <w:t xml:space="preserve">             &lt;/div&gt;</w:t>
+        <w:br/>
+        <w:br/>
+        <w:t xml:space="preserve">             &lt;p class="text-[10px] font-bold text-slate-500 uppercase tracking-widest pl-2 mb-3 md:mb-4"&gt;Menu Utama&lt;/p&gt;</w:t>
+        <w:br/>
+        <w:br/>
+        <w:t xml:space="preserve">             &lt;a href="{{ route('dashboard') }}" class="flex items-center px-4 md:px-5 py-3 md:py-3.5 rounded-xl font-bold text-sm transition-all @if(request()-&gt;routeIs('dashboard')) bg-cyan-500 text-slate-950 shadow-[0_0_15px_rgba(6,182,212,0.35)] @else text-slate-400 hover:bg-slate-800 hover:text-white @endif"&gt;</w:t>
+        <w:br/>
+        <w:t xml:space="preserve">                 Command Center</w:t>
+        <w:br/>
+        <w:t xml:space="preserve">             &lt;/a&gt;</w:t>
+        <w:br/>
+        <w:br/>
+        <w:t xml:space="preserve">             &lt;a href="{{ route('contacts.index') }}" class="flex items-center px-4 md:px-5 py-3 md:py-3.5 rounded-xl font-bold text-sm transition-all @if(request()-&gt;routeIs('contacts.index')) bg-cyan-500 text-slate-950 shadow-[0_0_15px_rgba(6,182,212,0.35)] @else text-slate-400 hover:bg-slate-800 hover:text-white @endif"&gt;</w:t>
+        <w:br/>
+        <w:t xml:space="preserve">                 Manajemen Kontak</w:t>
+        <w:br/>
+        <w:t xml:space="preserve">             &lt;/a&gt;</w:t>
+        <w:br/>
+        <w:br/>
+        <w:t xml:space="preserve">             &lt;a href="{{ route('threshold.index') }}" class="flex items-center px-4 md:px-5 py-3 md:py-3.5 rounded-xl font-bold text-sm transition-all @if(request()-&gt;routeIs('threshold.index')) bg-cyan-500 text-slate-950 shadow-[0_0_15px_rgba(6,182,212,0.35)] @else text-slate-400 hover:bg-slate-800 hover:text-white @endif"&gt;</w:t>
+        <w:br/>
+        <w:t xml:space="preserve">                 Ambang Batas</w:t>
+        <w:br/>
+        <w:t xml:space="preserve">             &lt;/a&gt;</w:t>
+        <w:br/>
+        <w:br/>
+        <w:t xml:space="preserve">             &lt;form method="POST" action="{{ route('logout') }}" class="w-full block pt-2 border-t border-slate-800/60"&gt;</w:t>
+        <w:br/>
+        <w:t xml:space="preserve">                 @csrf</w:t>
+        <w:br/>
+        <w:t xml:space="preserve">                 &lt;button type="submit" class="w-full flex items-center px-4 md:px-5 py-3 md:py-3.5 rounded-xl font-bold text-sm text-rose-400 hover:bg-rose-500/10 transition-all text-left"&gt;</w:t>
+        <w:br/>
+        <w:t xml:space="preserve">                     Logout / Keluar</w:t>
+        <w:br/>
+        <w:t xml:space="preserve">                 &lt;/button&gt;</w:t>
+        <w:br/>
+        <w:t xml:space="preserve">             &lt;/form&gt;</w:t>
+        <w:br/>
+        <w:t xml:space="preserve">         &lt;/div&gt;</w:t>
+        <w:br/>
+        <w:br/>
+        <w:t xml:space="preserve">         @if(auth()-&gt;check())</w:t>
+        <w:br/>
+        <w:t xml:space="preserve">             &lt;div class="mt-auto pt-4 border-t border-slate-800 w-full block shrink-0"&gt;</w:t>
+        <w:br/>
+        <w:t xml:space="preserve">                 &lt;div class="px-4 py-3 bg-slate-950 rounded-xl border border-slate-800/80 overflow-hidden"&gt;</w:t>
+        <w:br/>
+        <w:t xml:space="preserve">                     &lt;p class="font-bold text-white text-xs truncate"&gt;{{ auth()-&gt;user()-&gt;name }}&lt;/p&gt;</w:t>
+        <w:br/>
+        <w:t xml:space="preserve">                     &lt;p class="text-[10px] text-slate-500 truncate mt-0.5"&gt;{{ auth()-&gt;user()-&gt;email }}&lt;/p&gt;</w:t>
+        <w:br/>
+        <w:t xml:space="preserve">                 &lt;/div&gt;</w:t>
+        <w:br/>
+        <w:t xml:space="preserve">             &lt;/div&gt;</w:t>
+        <w:br/>
+        <w:t xml:space="preserve">         @endif</w:t>
         <w:br/>
         <w:t xml:space="preserve">    &lt;/div&gt;</w:t>
         <w:br/>

</xml_diff>